<commit_message>
se agregdo SIDPOL clickable en encabezado con resumen de accidente
</commit_message>
<xml_diff>
--- a/plantillas/manifestacion_familiar.docx
+++ b/plantillas/manifestacion_familiar.docx
@@ -767,7 +767,15 @@
           <w:rFonts w:ascii="Arial" w:hAnsi="Arial" w:cs="Arial"/>
           <w:color w:val="FF0000"/>
         </w:rPr>
-        <w:t>fal_nombres</w:t>
+        <w:t>fal_</w:t>
+      </w:r>
+      <w:proofErr w:type="gramStart"/>
+      <w:r>
+        <w:rPr>
+          <w:rFonts w:ascii="Arial" w:hAnsi="Arial" w:cs="Arial"/>
+          <w:color w:val="FF0000"/>
+        </w:rPr>
+        <w:t>nombres</w:t>
       </w:r>
       <w:proofErr w:type="spellEnd"/>
       <w:r>
@@ -800,6 +808,7 @@
         </w:rPr>
         <w:t>$</w:t>
       </w:r>
+      <w:proofErr w:type="gramEnd"/>
       <w:r>
         <w:rPr>
           <w:rFonts w:ascii="Arial" w:hAnsi="Arial" w:cs="Arial"/>
@@ -813,7 +822,15 @@
           <w:rFonts w:ascii="Arial" w:hAnsi="Arial" w:cs="Arial"/>
           <w:color w:val="FF0000"/>
         </w:rPr>
-        <w:t>fal_apellido_paterno</w:t>
+        <w:t>fal_apellido_</w:t>
+      </w:r>
+      <w:proofErr w:type="gramStart"/>
+      <w:r>
+        <w:rPr>
+          <w:rFonts w:ascii="Arial" w:hAnsi="Arial" w:cs="Arial"/>
+          <w:color w:val="FF0000"/>
+        </w:rPr>
+        <w:t>paterno</w:t>
       </w:r>
       <w:proofErr w:type="spellEnd"/>
       <w:r>
@@ -845,6 +862,7 @@
         </w:rPr>
         <w:t>$</w:t>
       </w:r>
+      <w:proofErr w:type="gramEnd"/>
       <w:r>
         <w:rPr>
           <w:rFonts w:ascii="Arial" w:hAnsi="Arial" w:cs="Arial"/>
@@ -1477,16 +1495,8 @@
               <w:rPr>
                 <w:rFonts w:ascii="Arial" w:hAnsi="Arial" w:cs="Arial"/>
                 <w:color w:val="FF0000"/>
-                <w:highlight w:val="yellow"/>
-              </w:rPr>
-              <w:t>$</w:t>
-            </w:r>
-            <w:r>
-              <w:rPr>
-                <w:rFonts w:ascii="Arial" w:hAnsi="Arial" w:cs="Arial"/>
-                <w:color w:val="FF0000"/>
-              </w:rPr>
-              <w:t>{</w:t>
+              </w:rPr>
+              <w:t>${</w:t>
             </w:r>
             <w:proofErr w:type="spellStart"/>
             <w:r>
@@ -1494,7 +1504,7 @@
                 <w:rFonts w:ascii="Arial" w:hAnsi="Arial" w:cs="Arial"/>
                 <w:color w:val="FF0000"/>
               </w:rPr>
-              <w:t>fal_num_doc</w:t>
+              <w:t>fam_num_doc</w:t>
             </w:r>
             <w:proofErr w:type="spellEnd"/>
             <w:r>
@@ -1568,27 +1578,18 @@
               <w:rPr>
                 <w:rFonts w:ascii="Arial" w:hAnsi="Arial" w:cs="Arial"/>
                 <w:color w:val="FF0000"/>
-                <w:highlight w:val="yellow"/>
                 <w:lang w:val="es-ES_tradnl"/>
               </w:rPr>
-              <w:t>$</w:t>
-            </w:r>
+              <w:t>${</w:t>
+            </w:r>
+            <w:proofErr w:type="spellStart"/>
             <w:r>
               <w:rPr>
                 <w:rFonts w:ascii="Arial" w:hAnsi="Arial" w:cs="Arial"/>
                 <w:color w:val="FF0000"/>
                 <w:lang w:val="es-ES_tradnl"/>
               </w:rPr>
-              <w:t>{</w:t>
-            </w:r>
-            <w:proofErr w:type="spellStart"/>
-            <w:r>
-              <w:rPr>
-                <w:rFonts w:ascii="Arial" w:hAnsi="Arial" w:cs="Arial"/>
-                <w:color w:val="FF0000"/>
-                <w:lang w:val="es-ES_tradnl"/>
-              </w:rPr>
-              <w:t>fal_fecha_nacimiento</w:t>
+              <w:t>fam_fecha_nacimiento</w:t>
             </w:r>
             <w:proofErr w:type="spellEnd"/>
             <w:r>
@@ -1679,7 +1680,21 @@
                 <w:rFonts w:ascii="Arial" w:hAnsi="Arial" w:cs="Arial"/>
                 <w:color w:val="FF0000"/>
               </w:rPr>
-              <w:t>fal_departamento_nac</w:t>
+              <w:t>fa</w:t>
+            </w:r>
+            <w:r>
+              <w:rPr>
+                <w:rFonts w:ascii="Arial" w:hAnsi="Arial" w:cs="Arial"/>
+                <w:color w:val="FF0000"/>
+              </w:rPr>
+              <w:t>m</w:t>
+            </w:r>
+            <w:r>
+              <w:rPr>
+                <w:rFonts w:ascii="Arial" w:hAnsi="Arial" w:cs="Arial"/>
+                <w:color w:val="FF0000"/>
+              </w:rPr>
+              <w:t>_departamento_nac</w:t>
             </w:r>
             <w:proofErr w:type="spellEnd"/>
             <w:r>
@@ -1769,7 +1784,21 @@
                 <w:rFonts w:ascii="Arial" w:hAnsi="Arial" w:cs="Arial"/>
                 <w:color w:val="FF0000"/>
               </w:rPr>
-              <w:t>fal_distrito_nac</w:t>
+              <w:t>fa</w:t>
+            </w:r>
+            <w:r>
+              <w:rPr>
+                <w:rFonts w:ascii="Arial" w:hAnsi="Arial" w:cs="Arial"/>
+                <w:color w:val="FF0000"/>
+              </w:rPr>
+              <w:t>m</w:t>
+            </w:r>
+            <w:r>
+              <w:rPr>
+                <w:rFonts w:ascii="Arial" w:hAnsi="Arial" w:cs="Arial"/>
+                <w:color w:val="FF0000"/>
+              </w:rPr>
+              <w:t>_distrito_nac</w:t>
             </w:r>
             <w:proofErr w:type="spellEnd"/>
             <w:r>
@@ -1863,7 +1892,23 @@
                 <w:color w:val="FF0000"/>
                 <w:lang w:val="es-PE"/>
               </w:rPr>
-              <w:t>fal_provincia_nac</w:t>
+              <w:t>fa</w:t>
+            </w:r>
+            <w:r>
+              <w:rPr>
+                <w:rFonts w:ascii="Arial" w:hAnsi="Arial" w:cs="Arial"/>
+                <w:color w:val="FF0000"/>
+                <w:lang w:val="es-PE"/>
+              </w:rPr>
+              <w:t>m</w:t>
+            </w:r>
+            <w:r>
+              <w:rPr>
+                <w:rFonts w:ascii="Arial" w:hAnsi="Arial" w:cs="Arial"/>
+                <w:color w:val="FF0000"/>
+                <w:lang w:val="es-PE"/>
+              </w:rPr>
+              <w:t>_provincia_nac</w:t>
             </w:r>
             <w:proofErr w:type="spellEnd"/>
             <w:r>
@@ -1957,7 +2002,23 @@
                 <w:color w:val="FF0000"/>
                 <w:lang w:val="es-ES_tradnl"/>
               </w:rPr>
-              <w:t>fal_fecha_nacimiento</w:t>
+              <w:t>fa</w:t>
+            </w:r>
+            <w:r>
+              <w:rPr>
+                <w:rFonts w:ascii="Arial" w:hAnsi="Arial" w:cs="Arial"/>
+                <w:color w:val="FF0000"/>
+                <w:lang w:val="es-ES_tradnl"/>
+              </w:rPr>
+              <w:t>m</w:t>
+            </w:r>
+            <w:r>
+              <w:rPr>
+                <w:rFonts w:ascii="Arial" w:hAnsi="Arial" w:cs="Arial"/>
+                <w:color w:val="FF0000"/>
+                <w:lang w:val="es-ES_tradnl"/>
+              </w:rPr>
+              <w:t>_fecha_nacimiento</w:t>
             </w:r>
             <w:proofErr w:type="spellEnd"/>
             <w:r>
@@ -3009,15 +3070,6 @@
     </w:p>
     <w:p>
       <w:pPr>
-        <w:rPr>
-          <w:rFonts w:ascii="Arial" w:hAnsi="Arial" w:cs="Arial"/>
-          <w:color w:val="FF0000"/>
-          <w:lang w:val="es-ES_tradnl" w:eastAsia="es-ES_tradnl"/>
-        </w:rPr>
-      </w:pPr>
-    </w:p>
-    <w:p>
-      <w:pPr>
         <w:jc w:val="both"/>
         <w:rPr>
           <w:rFonts w:ascii="Arial" w:hAnsi="Arial" w:cs="Arial"/>
@@ -3230,16 +3282,7 @@
           <w:color w:val="FF0000"/>
           <w:szCs w:val="24"/>
         </w:rPr>
-        <w:t xml:space="preserve">se encuentra </w:t>
-      </w:r>
-      <w:proofErr w:type="gramStart"/>
-      <w:r>
-        <w:rPr>
-          <w:rFonts w:cs="Arial"/>
-          <w:color w:val="FF0000"/>
-          <w:szCs w:val="24"/>
-        </w:rPr>
-        <w:t xml:space="preserve">presente </w:t>
+        <w:t>se encuentra presente</w:t>
       </w:r>
       <w:r>
         <w:rPr>
@@ -3249,7 +3292,6 @@
         </w:rPr>
         <w:t>.</w:t>
       </w:r>
-      <w:proofErr w:type="gramEnd"/>
       <w:r>
         <w:rPr>
           <w:rFonts w:cs="Arial"/>
@@ -3362,17 +3404,15 @@
         </w:rPr>
         <w:t xml:space="preserve">me encuentro rindiendo mi manifestación como familiar </w:t>
       </w:r>
-      <w:proofErr w:type="spellStart"/>
-      <w:r>
-        <w:rPr>
-          <w:rFonts w:cs="Arial"/>
-          <w:color w:val="FF0000"/>
-          <w:szCs w:val="24"/>
-          <w:lang w:val="es-ES_tradnl" w:eastAsia="es-ES_tradnl"/>
-        </w:rPr>
-        <w:t>mas</w:t>
-      </w:r>
-      <w:proofErr w:type="spellEnd"/>
+      <w:r>
+        <w:rPr>
+          <w:rFonts w:cs="Arial"/>
+          <w:color w:val="FF0000"/>
+          <w:szCs w:val="24"/>
+          <w:lang w:val="es-ES_tradnl" w:eastAsia="es-ES_tradnl"/>
+        </w:rPr>
+        <w:t>más</w:t>
+      </w:r>
       <w:r>
         <w:rPr>
           <w:rFonts w:cs="Arial"/>
@@ -3382,17 +3422,15 @@
         </w:rPr>
         <w:t xml:space="preserve"> cercano de mi hijo el cual resulto fallecido el día de hoy a consecuencia de accidente de </w:t>
       </w:r>
-      <w:proofErr w:type="spellStart"/>
-      <w:r>
-        <w:rPr>
-          <w:rFonts w:cs="Arial"/>
-          <w:color w:val="FF0000"/>
-          <w:szCs w:val="24"/>
-          <w:lang w:val="es-ES_tradnl" w:eastAsia="es-ES_tradnl"/>
-        </w:rPr>
-        <w:t>transito</w:t>
-      </w:r>
-      <w:proofErr w:type="spellEnd"/>
+      <w:r>
+        <w:rPr>
+          <w:rFonts w:cs="Arial"/>
+          <w:color w:val="FF0000"/>
+          <w:szCs w:val="24"/>
+          <w:lang w:val="es-ES_tradnl" w:eastAsia="es-ES_tradnl"/>
+        </w:rPr>
+        <w:t>tránsito</w:t>
+      </w:r>
       <w:r>
         <w:rPr>
           <w:rFonts w:cs="Arial"/>
@@ -3569,7 +3607,19 @@
           <w:sz w:val="24"/>
           <w:szCs w:val="24"/>
         </w:rPr>
-        <w:t>fal_apellido_paterno</w:t>
+        <w:t>fal_apellido_</w:t>
+      </w:r>
+      <w:proofErr w:type="gramStart"/>
+      <w:r>
+        <w:rPr>
+          <w:rStyle w:val="FontStyle13"/>
+          <w:b/>
+          <w:bCs w:val="0"/>
+          <w:color w:val="FF0000"/>
+          <w:sz w:val="24"/>
+          <w:szCs w:val="24"/>
+        </w:rPr>
+        <w:t>paterno</w:t>
       </w:r>
       <w:proofErr w:type="spellEnd"/>
       <w:r>
@@ -3581,7 +3631,29 @@
           <w:sz w:val="24"/>
           <w:szCs w:val="24"/>
         </w:rPr>
-        <w:t xml:space="preserve">} </w:t>
+        <w:t>}</w:t>
+      </w:r>
+      <w:r>
+        <w:rPr>
+          <w:rStyle w:val="FontStyle13"/>
+          <w:b/>
+          <w:bCs w:val="0"/>
+          <w:color w:val="FF0000"/>
+          <w:sz w:val="24"/>
+          <w:szCs w:val="24"/>
+        </w:rPr>
+        <w:t xml:space="preserve"> </w:t>
+      </w:r>
+      <w:r>
+        <w:rPr>
+          <w:rStyle w:val="FontStyle13"/>
+          <w:b/>
+          <w:bCs w:val="0"/>
+          <w:color w:val="FF0000"/>
+          <w:sz w:val="24"/>
+          <w:szCs w:val="24"/>
+        </w:rPr>
+        <w:t xml:space="preserve"> </w:t>
       </w:r>
       <w:r>
         <w:rPr>
@@ -3595,6 +3667,7 @@
         </w:rPr>
         <w:t>$</w:t>
       </w:r>
+      <w:proofErr w:type="gramEnd"/>
       <w:r>
         <w:rPr>
           <w:rStyle w:val="FontStyle13"/>
@@ -4754,55 +4827,7 @@
           <w:sz w:val="24"/>
           <w:szCs w:val="24"/>
         </w:rPr>
-        <w:t xml:space="preserve"> su hijo Q.E.V.F. </w:t>
-      </w:r>
-      <w:proofErr w:type="spellStart"/>
-      <w:r>
-        <w:rPr>
-          <w:rStyle w:val="FontStyle13"/>
-          <w:b/>
-          <w:bCs w:val="0"/>
-          <w:color w:val="FF0000"/>
-          <w:sz w:val="24"/>
-          <w:szCs w:val="24"/>
-        </w:rPr>
-        <w:t>Ericcson</w:t>
-      </w:r>
-      <w:proofErr w:type="spellEnd"/>
-      <w:r>
-        <w:rPr>
-          <w:rStyle w:val="FontStyle13"/>
-          <w:b/>
-          <w:bCs w:val="0"/>
-          <w:color w:val="FF0000"/>
-          <w:sz w:val="24"/>
-          <w:szCs w:val="24"/>
-        </w:rPr>
-        <w:t xml:space="preserve"> </w:t>
-      </w:r>
-      <w:proofErr w:type="spellStart"/>
-      <w:r>
-        <w:rPr>
-          <w:rStyle w:val="FontStyle13"/>
-          <w:b/>
-          <w:bCs w:val="0"/>
-          <w:color w:val="FF0000"/>
-          <w:sz w:val="24"/>
-          <w:szCs w:val="24"/>
-        </w:rPr>
-        <w:t>Jhoan</w:t>
-      </w:r>
-      <w:proofErr w:type="spellEnd"/>
-      <w:r>
-        <w:rPr>
-          <w:rStyle w:val="FontStyle13"/>
-          <w:b/>
-          <w:bCs w:val="0"/>
-          <w:color w:val="FF0000"/>
-          <w:sz w:val="24"/>
-          <w:szCs w:val="24"/>
-        </w:rPr>
-        <w:t xml:space="preserve"> TEJADA NAMUCHE</w:t>
+        <w:t xml:space="preserve"> su hijo Q.E.V.F. Ericcson Jhoan TEJADA NAMUCHE</w:t>
       </w:r>
       <w:r>
         <w:rPr>
@@ -5376,55 +5401,7 @@
           <w:sz w:val="24"/>
           <w:szCs w:val="24"/>
         </w:rPr>
-        <w:t xml:space="preserve">Si algún familiar, propietario del </w:t>
-      </w:r>
-      <w:proofErr w:type="spellStart"/>
-      <w:r>
-        <w:rPr>
-          <w:rStyle w:val="FontStyle13"/>
-          <w:b/>
-          <w:bCs w:val="0"/>
-          <w:color w:val="FF0000"/>
-          <w:sz w:val="24"/>
-          <w:szCs w:val="24"/>
-        </w:rPr>
-        <w:t>vehiculo</w:t>
-      </w:r>
-      <w:proofErr w:type="spellEnd"/>
-      <w:r>
-        <w:rPr>
-          <w:rStyle w:val="FontStyle13"/>
-          <w:b/>
-          <w:bCs w:val="0"/>
-          <w:color w:val="FF0000"/>
-          <w:sz w:val="24"/>
-          <w:szCs w:val="24"/>
-        </w:rPr>
-        <w:t xml:space="preserve"> o empresa de transporte a donde pertenezca el </w:t>
-      </w:r>
-      <w:proofErr w:type="spellStart"/>
-      <w:r>
-        <w:rPr>
-          <w:rStyle w:val="FontStyle13"/>
-          <w:b/>
-          <w:bCs w:val="0"/>
-          <w:color w:val="FF0000"/>
-          <w:sz w:val="24"/>
-          <w:szCs w:val="24"/>
-        </w:rPr>
-        <w:t>vehiculo</w:t>
-      </w:r>
-      <w:proofErr w:type="spellEnd"/>
-      <w:r>
-        <w:rPr>
-          <w:rStyle w:val="FontStyle13"/>
-          <w:b/>
-          <w:bCs w:val="0"/>
-          <w:color w:val="FF0000"/>
-          <w:sz w:val="24"/>
-          <w:szCs w:val="24"/>
-        </w:rPr>
-        <w:t xml:space="preserve"> ha tenido acercamiento con Ud. con la finalidad de apoyarlo económicamente</w:t>
+        <w:t>Si algún familiar, propietario del vehiculo o empresa de transporte a donde pertenezca el vehiculo ha tenido acercamiento con Ud. con la finalidad de apoyarlo económicamente</w:t>
       </w:r>
       <w:r>
         <w:rPr>

</xml_diff>